<commit_message>
Resume: icon header, merged project bullets, phone
Co-Authored-By: Claude Sonnet 5.5 <noreply@anthropic.com>
Claude-Session: https://claude.ai/code/session_0119xxGj3NY185HcqPsLitZ4
</commit_message>
<xml_diff>
--- a/resume/Ajay_I_Resume.docx
+++ b/resume/Ajay_I_Resume.docx
@@ -9,7 +9,7 @@
       </w:pPr>
       <w:r>
         <w:rPr>
-          <w:rFonts w:ascii="Calibri" w:hAnsi="Calibri"/>
+          <w:rFonts w:ascii="Raleway" w:hAnsi="Raleway" w:cs="Raleway"/>
           <w:b/>
           <w:i w:val="0"/>
           <w:sz w:val="50"/>
@@ -19,9 +19,57 @@
     </w:p>
     <w:p>
       <w:pPr>
-        <w:spacing w:before="40" w:after="0"/>
+        <w:spacing w:before="60" w:after="0"/>
         <w:jc w:val="center"/>
       </w:pPr>
+      <w:r>
+        <w:rPr>
+          <w:position w:val="0"/>
+        </w:rPr>
+        <w:drawing>
+          <wp:inline xmlns:a="http://schemas.openxmlformats.org/drawingml/2006/main" xmlns:pic="http://schemas.openxmlformats.org/drawingml/2006/picture">
+            <wp:extent cx="152400" cy="152400"/>
+            <wp:docPr id="1" name="Picture 1"/>
+            <wp:cNvGraphicFramePr>
+              <a:graphicFrameLocks noChangeAspect="1"/>
+            </wp:cNvGraphicFramePr>
+            <a:graphic>
+              <a:graphicData uri="http://schemas.openxmlformats.org/drawingml/2006/picture">
+                <pic:pic>
+                  <pic:nvPicPr>
+                    <pic:cNvPr id="0" name="icon_mail.png"/>
+                    <pic:cNvPicPr/>
+                  </pic:nvPicPr>
+                  <pic:blipFill>
+                    <a:blip r:embed="rId9"/>
+                    <a:stretch>
+                      <a:fillRect/>
+                    </a:stretch>
+                  </pic:blipFill>
+                  <pic:spPr>
+                    <a:xfrm>
+                      <a:off x="0" y="0"/>
+                      <a:ext cx="152400" cy="152400"/>
+                    </a:xfrm>
+                    <a:prstGeom prst="rect"/>
+                  </pic:spPr>
+                </pic:pic>
+              </a:graphicData>
+            </a:graphic>
+          </wp:inline>
+        </w:drawing>
+      </w:r>
+      <w:hyperlink r:id="rId10">
+        <w:r>
+          <w:rPr>
+            <w:rFonts w:ascii="Calibri" w:hAnsi="Calibri"/>
+            <w:color w:val="1F4E9C"/>
+            <w:sz w:val="19"/>
+            <w:u w:val="single"/>
+          </w:rPr>
+          <w:t xml:space="preserve">ajayiyanraj.2401007@srec.ac.in</w:t>
+        </w:r>
+      </w:hyperlink>
       <w:r>
         <w:rPr>
           <w:rFonts w:ascii="Calibri" w:hAnsi="Calibri"/>
@@ -29,7 +77,44 @@
           <w:i w:val="0"/>
           <w:sz w:val="19"/>
         </w:rPr>
-        <w:t>ajayiyanraj.2401007@srec.ac.in</w:t>
+        <w:t xml:space="preserve"> | </w:t>
+      </w:r>
+      <w:r>
+        <w:rPr>
+          <w:position w:val="0"/>
+        </w:rPr>
+        <w:drawing>
+          <wp:inline xmlns:a="http://schemas.openxmlformats.org/drawingml/2006/main" xmlns:pic="http://schemas.openxmlformats.org/drawingml/2006/picture">
+            <wp:extent cx="152400" cy="152400"/>
+            <wp:docPr id="2" name="Picture 2"/>
+            <wp:cNvGraphicFramePr>
+              <a:graphicFrameLocks noChangeAspect="1"/>
+            </wp:cNvGraphicFramePr>
+            <a:graphic>
+              <a:graphicData uri="http://schemas.openxmlformats.org/drawingml/2006/picture">
+                <pic:pic>
+                  <pic:nvPicPr>
+                    <pic:cNvPr id="0" name="icon_phone.png"/>
+                    <pic:cNvPicPr/>
+                  </pic:nvPicPr>
+                  <pic:blipFill>
+                    <a:blip r:embed="rId11"/>
+                    <a:stretch>
+                      <a:fillRect/>
+                    </a:stretch>
+                  </pic:blipFill>
+                  <pic:spPr>
+                    <a:xfrm>
+                      <a:off x="0" y="0"/>
+                      <a:ext cx="152400" cy="152400"/>
+                    </a:xfrm>
+                    <a:prstGeom prst="rect"/>
+                  </pic:spPr>
+                </pic:pic>
+              </a:graphicData>
+            </a:graphic>
+          </wp:inline>
+        </w:drawing>
       </w:r>
       <w:r>
         <w:rPr>
@@ -38,9 +123,55 @@
           <w:i w:val="0"/>
           <w:sz w:val="19"/>
         </w:rPr>
-        <w:t xml:space="preserve">  |  </w:t>
+        <w:t>+91-8124297703</w:t>
       </w:r>
-      <w:hyperlink r:id="rId9">
+      <w:r>
+        <w:rPr>
+          <w:rFonts w:ascii="Calibri" w:hAnsi="Calibri"/>
+          <w:b w:val="0"/>
+          <w:i w:val="0"/>
+          <w:sz w:val="19"/>
+        </w:rPr>
+        <w:t xml:space="preserve"> | </w:t>
+      </w:r>
+      <w:r>
+        <w:rPr>
+          <w:position w:val="0"/>
+        </w:rPr>
+        <w:drawing>
+          <wp:inline xmlns:a="http://schemas.openxmlformats.org/drawingml/2006/main" xmlns:pic="http://schemas.openxmlformats.org/drawingml/2006/picture">
+            <wp:extent cx="152400" cy="152400"/>
+            <wp:docPr id="3" name="Picture 3"/>
+            <wp:cNvGraphicFramePr>
+              <a:graphicFrameLocks noChangeAspect="1"/>
+            </wp:cNvGraphicFramePr>
+            <a:graphic>
+              <a:graphicData uri="http://schemas.openxmlformats.org/drawingml/2006/picture">
+                <pic:pic>
+                  <pic:nvPicPr>
+                    <pic:cNvPr id="0" name="icon_in.png"/>
+                    <pic:cNvPicPr/>
+                  </pic:nvPicPr>
+                  <pic:blipFill>
+                    <a:blip r:embed="rId12"/>
+                    <a:stretch>
+                      <a:fillRect/>
+                    </a:stretch>
+                  </pic:blipFill>
+                  <pic:spPr>
+                    <a:xfrm>
+                      <a:off x="0" y="0"/>
+                      <a:ext cx="152400" cy="152400"/>
+                    </a:xfrm>
+                    <a:prstGeom prst="rect"/>
+                  </pic:spPr>
+                </pic:pic>
+              </a:graphicData>
+            </a:graphic>
+          </wp:inline>
+        </w:drawing>
+      </w:r>
+      <w:hyperlink r:id="rId13">
         <w:r>
           <w:rPr>
             <w:rFonts w:ascii="Calibri" w:hAnsi="Calibri"/>
@@ -58,9 +189,46 @@
           <w:i w:val="0"/>
           <w:sz w:val="19"/>
         </w:rPr>
-        <w:t xml:space="preserve">  |  </w:t>
+        <w:t xml:space="preserve"> | </w:t>
       </w:r>
-      <w:hyperlink r:id="rId10">
+      <w:r>
+        <w:rPr>
+          <w:position w:val="0"/>
+        </w:rPr>
+        <w:drawing>
+          <wp:inline xmlns:a="http://schemas.openxmlformats.org/drawingml/2006/main" xmlns:pic="http://schemas.openxmlformats.org/drawingml/2006/picture">
+            <wp:extent cx="152400" cy="152400"/>
+            <wp:docPr id="4" name="Picture 4"/>
+            <wp:cNvGraphicFramePr>
+              <a:graphicFrameLocks noChangeAspect="1"/>
+            </wp:cNvGraphicFramePr>
+            <a:graphic>
+              <a:graphicData uri="http://schemas.openxmlformats.org/drawingml/2006/picture">
+                <pic:pic>
+                  <pic:nvPicPr>
+                    <pic:cNvPr id="0" name="icon_gh.png"/>
+                    <pic:cNvPicPr/>
+                  </pic:nvPicPr>
+                  <pic:blipFill>
+                    <a:blip r:embed="rId14"/>
+                    <a:stretch>
+                      <a:fillRect/>
+                    </a:stretch>
+                  </pic:blipFill>
+                  <pic:spPr>
+                    <a:xfrm>
+                      <a:off x="0" y="0"/>
+                      <a:ext cx="152400" cy="152400"/>
+                    </a:xfrm>
+                    <a:prstGeom prst="rect"/>
+                  </pic:spPr>
+                </pic:pic>
+              </a:graphicData>
+            </a:graphic>
+          </wp:inline>
+        </w:drawing>
+      </w:r>
+      <w:hyperlink r:id="rId15">
         <w:r>
           <w:rPr>
             <w:rFonts w:ascii="Calibri" w:hAnsi="Calibri"/>
@@ -78,9 +246,46 @@
           <w:i w:val="0"/>
           <w:sz w:val="19"/>
         </w:rPr>
-        <w:t xml:space="preserve">  |  </w:t>
+        <w:t xml:space="preserve"> | </w:t>
       </w:r>
-      <w:hyperlink r:id="rId11">
+      <w:r>
+        <w:rPr>
+          <w:position w:val="0"/>
+        </w:rPr>
+        <w:drawing>
+          <wp:inline xmlns:a="http://schemas.openxmlformats.org/drawingml/2006/main" xmlns:pic="http://schemas.openxmlformats.org/drawingml/2006/picture">
+            <wp:extent cx="152400" cy="152400"/>
+            <wp:docPr id="5" name="Picture 5"/>
+            <wp:cNvGraphicFramePr>
+              <a:graphicFrameLocks noChangeAspect="1"/>
+            </wp:cNvGraphicFramePr>
+            <a:graphic>
+              <a:graphicData uri="http://schemas.openxmlformats.org/drawingml/2006/picture">
+                <pic:pic>
+                  <pic:nvPicPr>
+                    <pic:cNvPr id="0" name="icon_lc.png"/>
+                    <pic:cNvPicPr/>
+                  </pic:nvPicPr>
+                  <pic:blipFill>
+                    <a:blip r:embed="rId16"/>
+                    <a:stretch>
+                      <a:fillRect/>
+                    </a:stretch>
+                  </pic:blipFill>
+                  <pic:spPr>
+                    <a:xfrm>
+                      <a:off x="0" y="0"/>
+                      <a:ext cx="152400" cy="152400"/>
+                    </a:xfrm>
+                    <a:prstGeom prst="rect"/>
+                  </pic:spPr>
+                </pic:pic>
+              </a:graphicData>
+            </a:graphic>
+          </wp:inline>
+        </w:drawing>
+      </w:r>
+      <w:hyperlink r:id="rId17">
         <w:r>
           <w:rPr>
             <w:rFonts w:ascii="Calibri" w:hAnsi="Calibri"/>
@@ -186,7 +391,7 @@
           <w:rFonts w:ascii="Calibri" w:hAnsi="Calibri"/>
           <w:b w:val="0"/>
           <w:i w:val="0"/>
-          <w:sz w:val="18"/>
+          <w:sz w:val="19"/>
         </w:rPr>
         <w:t xml:space="preserve">B.E. Computer Science and Engineering (Anna University) | </w:t>
       </w:r>
@@ -195,7 +400,7 @@
           <w:rFonts w:ascii="Calibri" w:hAnsi="Calibri"/>
           <w:b/>
           <w:i w:val="0"/>
-          <w:sz w:val="18"/>
+          <w:sz w:val="19"/>
         </w:rPr>
         <w:t>CGPA: 9.08 / 10</w:t>
       </w:r>
@@ -204,7 +409,7 @@
           <w:rFonts w:ascii="Calibri" w:hAnsi="Calibri"/>
           <w:b w:val="0"/>
           <w:i w:val="0"/>
-          <w:sz w:val="18"/>
+          <w:sz w:val="19"/>
         </w:rPr>
         <w:t xml:space="preserve"> (up to 4th Sem)</w:t>
       </w:r>
@@ -221,7 +426,7 @@
           <w:rFonts w:ascii="Calibri" w:hAnsi="Calibri"/>
           <w:b w:val="0"/>
           <w:i w:val="0"/>
-          <w:sz w:val="18"/>
+          <w:sz w:val="19"/>
         </w:rPr>
         <w:t>Coimbatore, IN</w:t>
       </w:r>
@@ -267,7 +472,7 @@
           <w:rFonts w:ascii="Calibri" w:hAnsi="Calibri"/>
           <w:b w:val="0"/>
           <w:i w:val="0"/>
-          <w:sz w:val="18"/>
+          <w:sz w:val="19"/>
         </w:rPr>
         <w:t>HSC (2024) | SSLC (2022)</w:t>
       </w:r>
@@ -336,7 +541,7 @@
         <w:tabs>
           <w:tab w:pos="280" w:val="left"/>
         </w:tabs>
-        <w:spacing w:before="28" w:after="0"/>
+        <w:spacing w:before="40" w:after="0"/>
         <w:ind w:left="280" w:hanging="280"/>
       </w:pPr>
       <w:r>
@@ -377,7 +582,7 @@
         <w:tabs>
           <w:tab w:pos="280" w:val="left"/>
         </w:tabs>
-        <w:spacing w:before="28" w:after="0"/>
+        <w:spacing w:before="40" w:after="0"/>
         <w:ind w:left="280" w:hanging="280"/>
       </w:pPr>
       <w:r>
@@ -418,7 +623,7 @@
         <w:tabs>
           <w:tab w:pos="280" w:val="left"/>
         </w:tabs>
-        <w:spacing w:before="28" w:after="0"/>
+        <w:spacing w:before="40" w:after="0"/>
         <w:ind w:left="280" w:hanging="280"/>
       </w:pPr>
       <w:r>
@@ -509,48 +714,7 @@
         <w:tabs>
           <w:tab w:pos="280" w:val="left"/>
         </w:tabs>
-        <w:spacing w:before="28" w:after="0"/>
-        <w:ind w:left="280" w:hanging="280"/>
-      </w:pPr>
-      <w:r>
-        <w:rPr>
-          <w:rFonts w:ascii="Calibri" w:hAnsi="Calibri"/>
-          <w:b/>
-          <w:i w:val="0"/>
-        </w:rPr>
-        <w:t>→</w:t>
-      </w:r>
-      <w:r>
-        <w:rPr>
-          <w:rFonts w:ascii="Calibri" w:hAnsi="Calibri"/>
-          <w:b w:val="0"/>
-          <w:i w:val="0"/>
-        </w:rPr>
-        <w:tab/>
-      </w:r>
-      <w:r>
-        <w:rPr>
-          <w:rFonts w:ascii="Calibri" w:hAnsi="Calibri"/>
-          <w:b/>
-          <w:i w:val="0"/>
-        </w:rPr>
-        <w:t xml:space="preserve">Objective: </w:t>
-      </w:r>
-      <w:r>
-        <w:rPr>
-          <w:rFonts w:ascii="Calibri" w:hAnsi="Calibri"/>
-          <w:b w:val="0"/>
-          <w:i w:val="0"/>
-        </w:rPr>
-        <w:t>bridge the gap between employee activity volume and actual work impact through meaningful contribution metrics.</w:t>
-      </w:r>
-    </w:p>
-    <w:p>
-      <w:pPr>
-        <w:tabs>
-          <w:tab w:pos="280" w:val="left"/>
-        </w:tabs>
-        <w:spacing w:before="28" w:after="0"/>
+        <w:spacing w:before="40" w:after="0"/>
         <w:ind w:left="280" w:hanging="280"/>
       </w:pPr>
       <w:r>
@@ -575,7 +739,7 @@
           <w:b w:val="0"/>
           <w:i w:val="0"/>
         </w:rPr>
-        <w:t>Built a full-stack evaluation system integrating data from communication (</w:t>
+        <w:t>Built a full-stack evaluation system that integrates communication (</w:t>
       </w:r>
       <w:r>
         <w:rPr>
@@ -607,7 +771,7 @@
           <w:b w:val="0"/>
           <w:i w:val="0"/>
         </w:rPr>
-        <w:t xml:space="preserve">) platforms; automated API-based </w:t>
+        <w:t xml:space="preserve">) platform data through automated API-based </w:t>
       </w:r>
       <w:r>
         <w:rPr>
@@ -623,7 +787,7 @@
           <w:b w:val="0"/>
           <w:i w:val="0"/>
         </w:rPr>
-        <w:t xml:space="preserve"> fetch, process and normalize multi-source data.</w:t>
+        <w:t xml:space="preserve"> to bridge the gap between employee activity volume and actual work impact, using a modular backend with efficient database handling for scalability and real-time processing.</w:t>
       </w:r>
     </w:p>
     <w:p>
@@ -631,7 +795,7 @@
         <w:tabs>
           <w:tab w:pos="280" w:val="left"/>
         </w:tabs>
-        <w:spacing w:before="28" w:after="0"/>
+        <w:spacing w:before="40" w:after="0"/>
         <w:ind w:left="280" w:hanging="280"/>
       </w:pPr>
       <w:r>
@@ -672,45 +836,12 @@
           <w:b w:val="0"/>
           <w:i w:val="0"/>
         </w:rPr>
-        <w:t xml:space="preserve"> separating high-activity from high-impact contributions, shown on an interactive, responsive dashboard of trends and performance indicators.</w:t>
+        <w:t xml:space="preserve"> that separates high-activity from high-impact contributions and presented the results on an interactive, responsive dashboard of contribution patterns, trends and performance indicators.</w:t>
       </w:r>
     </w:p>
     <w:p>
       <w:pPr>
-        <w:tabs>
-          <w:tab w:pos="280" w:val="left"/>
-        </w:tabs>
-        <w:spacing w:before="28" w:after="0"/>
-        <w:ind w:left="280" w:hanging="280"/>
-      </w:pPr>
-      <w:r>
-        <w:rPr>
-          <w:rFonts w:ascii="Calibri" w:hAnsi="Calibri"/>
-          <w:b/>
-          <w:i w:val="0"/>
-        </w:rPr>
-        <w:t>→</w:t>
-      </w:r>
-      <w:r>
-        <w:rPr>
-          <w:rFonts w:ascii="Calibri" w:hAnsi="Calibri"/>
-          <w:b w:val="0"/>
-          <w:i w:val="0"/>
-        </w:rPr>
-        <w:tab/>
-      </w:r>
-      <w:r>
-        <w:rPr>
-          <w:rFonts w:ascii="Calibri" w:hAnsi="Calibri"/>
-          <w:b w:val="0"/>
-          <w:i w:val="0"/>
-        </w:rPr>
-        <w:t>Focused on modular backend architecture and efficient database handling for scalability, real-time processing and maintainability.</w:t>
-      </w:r>
-    </w:p>
-    <w:p>
-      <w:pPr>
-        <w:spacing w:before="28" w:after="0"/>
+        <w:spacing w:before="40" w:after="0"/>
       </w:pPr>
       <w:r>
         <w:rPr>
@@ -734,7 +865,7 @@
         <w:tabs>
           <w:tab w:pos="10710" w:val="right"/>
         </w:tabs>
-        <w:spacing w:before="90" w:after="0"/>
+        <w:spacing w:before="100" w:after="0"/>
       </w:pPr>
       <w:r>
         <w:rPr>
@@ -765,48 +896,7 @@
         <w:tabs>
           <w:tab w:pos="280" w:val="left"/>
         </w:tabs>
-        <w:spacing w:before="28" w:after="0"/>
-        <w:ind w:left="280" w:hanging="280"/>
-      </w:pPr>
-      <w:r>
-        <w:rPr>
-          <w:rFonts w:ascii="Calibri" w:hAnsi="Calibri"/>
-          <w:b/>
-          <w:i w:val="0"/>
-        </w:rPr>
-        <w:t>→</w:t>
-      </w:r>
-      <w:r>
-        <w:rPr>
-          <w:rFonts w:ascii="Calibri" w:hAnsi="Calibri"/>
-          <w:b w:val="0"/>
-          <w:i w:val="0"/>
-        </w:rPr>
-        <w:tab/>
-      </w:r>
-      <w:r>
-        <w:rPr>
-          <w:rFonts w:ascii="Calibri" w:hAnsi="Calibri"/>
-          <w:b/>
-          <w:i w:val="0"/>
-        </w:rPr>
-        <w:t xml:space="preserve">Objective: </w:t>
-      </w:r>
-      <w:r>
-        <w:rPr>
-          <w:rFonts w:ascii="Calibri" w:hAnsi="Calibri"/>
-          <w:b w:val="0"/>
-          <w:i w:val="0"/>
-        </w:rPr>
-        <w:t>analyze customer sentiment, predict churn and automate personalized retention strategies.</w:t>
-      </w:r>
-    </w:p>
-    <w:p>
-      <w:pPr>
-        <w:tabs>
-          <w:tab w:pos="280" w:val="left"/>
-        </w:tabs>
-        <w:spacing w:before="28" w:after="0"/>
+        <w:spacing w:before="40" w:after="0"/>
         <w:ind w:left="280" w:hanging="280"/>
       </w:pPr>
       <w:r>
@@ -831,7 +921,7 @@
           <w:b w:val="0"/>
           <w:i w:val="0"/>
         </w:rPr>
-        <w:t xml:space="preserve">Analyzes multi-channel feedback using </w:t>
+        <w:t xml:space="preserve">Developed a system that analyzes multi-channel customer feedback using </w:t>
       </w:r>
       <w:r>
         <w:rPr>
@@ -847,7 +937,7 @@
           <w:b w:val="0"/>
           <w:i w:val="0"/>
         </w:rPr>
-        <w:t xml:space="preserve"> sentiment analysis and behavioral modeling to identify at-risk users.</w:t>
+        <w:t xml:space="preserve"> sentiment analysis and behavioral modeling to detect dissatisfaction, identify at-risk users and predict churn.</w:t>
       </w:r>
     </w:p>
     <w:p>
@@ -855,7 +945,7 @@
         <w:tabs>
           <w:tab w:pos="280" w:val="left"/>
         </w:tabs>
-        <w:spacing w:before="28" w:after="0"/>
+        <w:spacing w:before="40" w:after="0"/>
         <w:ind w:left="280" w:hanging="280"/>
       </w:pPr>
       <w:r>
@@ -880,40 +970,7 @@
           <w:b w:val="0"/>
           <w:i w:val="0"/>
         </w:rPr>
-        <w:t>Automated pipeline triggering personalized email and WhatsApp follow-ups based on risk levels.</w:t>
-      </w:r>
-    </w:p>
-    <w:p>
-      <w:pPr>
-        <w:tabs>
-          <w:tab w:pos="280" w:val="left"/>
-        </w:tabs>
-        <w:spacing w:before="28" w:after="0"/>
-        <w:ind w:left="280" w:hanging="280"/>
-      </w:pPr>
-      <w:r>
-        <w:rPr>
-          <w:rFonts w:ascii="Calibri" w:hAnsi="Calibri"/>
-          <w:b/>
-          <w:i w:val="0"/>
-        </w:rPr>
-        <w:t>→</w:t>
-      </w:r>
-      <w:r>
-        <w:rPr>
-          <w:rFonts w:ascii="Calibri" w:hAnsi="Calibri"/>
-          <w:b w:val="0"/>
-          <w:i w:val="0"/>
-        </w:rPr>
-        <w:tab/>
-      </w:r>
-      <w:r>
-        <w:rPr>
-          <w:rFonts w:ascii="Calibri" w:hAnsi="Calibri"/>
-          <w:b w:val="0"/>
-          <w:i w:val="0"/>
-        </w:rPr>
-        <w:t xml:space="preserve">Integrated a </w:t>
+        <w:t xml:space="preserve">Automated a personalized retention pipeline that triggers email and WhatsApp follow-ups by risk level, and integrated a </w:t>
       </w:r>
       <w:r>
         <w:rPr>
@@ -929,12 +986,12 @@
           <w:b w:val="0"/>
           <w:i w:val="0"/>
         </w:rPr>
-        <w:t xml:space="preserve"> recommending refunds, escalations or retention offers, improving decision efficiency.</w:t>
+        <w:t xml:space="preserve"> that recommends refunds, escalations or retention offers to improve decision efficiency.</w:t>
       </w:r>
     </w:p>
     <w:p>
       <w:pPr>
-        <w:spacing w:before="28" w:after="0"/>
+        <w:spacing w:before="40" w:after="0"/>
       </w:pPr>
       <w:r>
         <w:rPr>
@@ -958,7 +1015,7 @@
         <w:tabs>
           <w:tab w:pos="10710" w:val="right"/>
         </w:tabs>
-        <w:spacing w:before="90" w:after="0"/>
+        <w:spacing w:before="100" w:after="0"/>
       </w:pPr>
       <w:r>
         <w:rPr>
@@ -997,48 +1054,7 @@
         <w:tabs>
           <w:tab w:pos="280" w:val="left"/>
         </w:tabs>
-        <w:spacing w:before="28" w:after="0"/>
-        <w:ind w:left="280" w:hanging="280"/>
-      </w:pPr>
-      <w:r>
-        <w:rPr>
-          <w:rFonts w:ascii="Calibri" w:hAnsi="Calibri"/>
-          <w:b/>
-          <w:i w:val="0"/>
-        </w:rPr>
-        <w:t>→</w:t>
-      </w:r>
-      <w:r>
-        <w:rPr>
-          <w:rFonts w:ascii="Calibri" w:hAnsi="Calibri"/>
-          <w:b w:val="0"/>
-          <w:i w:val="0"/>
-        </w:rPr>
-        <w:tab/>
-      </w:r>
-      <w:r>
-        <w:rPr>
-          <w:rFonts w:ascii="Calibri" w:hAnsi="Calibri"/>
-          <w:b/>
-          <w:i w:val="0"/>
-        </w:rPr>
-        <w:t xml:space="preserve">Objective: </w:t>
-      </w:r>
-      <w:r>
-        <w:rPr>
-          <w:rFonts w:ascii="Calibri" w:hAnsi="Calibri"/>
-          <w:b w:val="0"/>
-          <w:i w:val="0"/>
-        </w:rPr>
-        <w:t>enable large-scale monitoring and prediction of water quality using satellite data and machine learning.</w:t>
-      </w:r>
-    </w:p>
-    <w:p>
-      <w:pPr>
-        <w:tabs>
-          <w:tab w:pos="280" w:val="left"/>
-        </w:tabs>
-        <w:spacing w:before="28" w:after="0"/>
+        <w:spacing w:before="40" w:after="0"/>
         <w:ind w:left="280" w:hanging="280"/>
       </w:pPr>
       <w:r>
@@ -1063,7 +1079,7 @@
           <w:b w:val="0"/>
           <w:i w:val="0"/>
         </w:rPr>
-        <w:t xml:space="preserve">Processed satellite and geospatial data to predict water quality parameters with a </w:t>
+        <w:t xml:space="preserve">Developed a system that processes satellite imagery and geospatial data to predict key water quality parameters with a </w:t>
       </w:r>
       <w:r>
         <w:rPr>
@@ -1079,7 +1095,7 @@
           <w:b w:val="0"/>
           <w:i w:val="0"/>
         </w:rPr>
-        <w:t>.</w:t>
+        <w:t>, using engineered spectral and environmental features, enabling large-scale monitoring without manual sampling.</w:t>
       </w:r>
     </w:p>
     <w:p>
@@ -1087,7 +1103,7 @@
         <w:tabs>
           <w:tab w:pos="280" w:val="left"/>
         </w:tabs>
-        <w:spacing w:before="28" w:after="0"/>
+        <w:spacing w:before="40" w:after="0"/>
         <w:ind w:left="280" w:hanging="280"/>
       </w:pPr>
       <w:r>
@@ -1112,12 +1128,12 @@
           <w:b w:val="0"/>
           <w:i w:val="0"/>
         </w:rPr>
-        <w:t>Built an automated ingestion, preprocessing and prediction pipeline with visualization of spatial and temporal trends.</w:t>
+        <w:t>Built an automated ingestion, preprocessing and prediction pipeline with visualization modules for spatial and temporal trend analysis.</w:t>
       </w:r>
     </w:p>
     <w:p>
       <w:pPr>
-        <w:spacing w:before="28" w:after="0"/>
+        <w:spacing w:before="40" w:after="0"/>
       </w:pPr>
       <w:r>
         <w:rPr>
@@ -1141,7 +1157,7 @@
         <w:tabs>
           <w:tab w:pos="10710" w:val="right"/>
         </w:tabs>
-        <w:spacing w:before="90" w:after="0"/>
+        <w:spacing w:before="100" w:after="0"/>
       </w:pPr>
       <w:r>
         <w:rPr>
@@ -1173,48 +1189,7 @@
         <w:tabs>
           <w:tab w:pos="280" w:val="left"/>
         </w:tabs>
-        <w:spacing w:before="28" w:after="0"/>
-        <w:ind w:left="280" w:hanging="280"/>
-      </w:pPr>
-      <w:r>
-        <w:rPr>
-          <w:rFonts w:ascii="Calibri" w:hAnsi="Calibri"/>
-          <w:b/>
-          <w:i w:val="0"/>
-        </w:rPr>
-        <w:t>→</w:t>
-      </w:r>
-      <w:r>
-        <w:rPr>
-          <w:rFonts w:ascii="Calibri" w:hAnsi="Calibri"/>
-          <w:b w:val="0"/>
-          <w:i w:val="0"/>
-        </w:rPr>
-        <w:tab/>
-      </w:r>
-      <w:r>
-        <w:rPr>
-          <w:rFonts w:ascii="Calibri" w:hAnsi="Calibri"/>
-          <w:b/>
-          <w:i w:val="0"/>
-        </w:rPr>
-        <w:t xml:space="preserve">Objective: </w:t>
-      </w:r>
-      <w:r>
-        <w:rPr>
-          <w:rFonts w:ascii="Calibri" w:hAnsi="Calibri"/>
-          <w:b w:val="0"/>
-          <w:i w:val="0"/>
-        </w:rPr>
-        <w:t>detect suspicious cryptocurrency transactions using machine learning and behavioural analysis.</w:t>
-      </w:r>
-    </w:p>
-    <w:p>
-      <w:pPr>
-        <w:tabs>
-          <w:tab w:pos="280" w:val="left"/>
-        </w:tabs>
-        <w:spacing w:before="28" w:after="0"/>
+        <w:spacing w:before="40" w:after="0"/>
         <w:ind w:left="280" w:hanging="280"/>
       </w:pPr>
       <w:r>
@@ -1239,7 +1214,7 @@
           <w:b w:val="0"/>
           <w:i w:val="0"/>
         </w:rPr>
-        <w:t xml:space="preserve">Built a real-time system using </w:t>
+        <w:t xml:space="preserve">Developed a real-time system to detect suspicious cryptocurrency transactions using </w:t>
       </w:r>
       <w:r>
         <w:rPr>
@@ -1255,12 +1230,12 @@
           <w:b w:val="0"/>
           <w:i w:val="0"/>
         </w:rPr>
-        <w:t>, graph analytics and multi-agent pattern detection to identify high-risk wallet activity and generate explainable risk scores.</w:t>
+        <w:t>, graph analytics and multi-agent pattern detection, identifying high-risk wallet activity and generating explainable risk scores.</w:t>
       </w:r>
     </w:p>
     <w:p>
       <w:pPr>
-        <w:spacing w:before="28" w:after="0"/>
+        <w:spacing w:before="40" w:after="0"/>
       </w:pPr>
       <w:r>
         <w:rPr>
@@ -1301,7 +1276,7 @@
       <w:pPr>
         <w:spacing w:before="20" w:after="0"/>
       </w:pPr>
-      <w:hyperlink r:id="rId12">
+      <w:hyperlink r:id="rId18">
         <w:r>
           <w:rPr>
             <w:rFonts w:ascii="Calibri" w:hAnsi="Calibri"/>
@@ -1318,12 +1293,12 @@
       <w:pPr>
         <w:spacing w:before="0" w:after="0"/>
       </w:pPr>
-      <w:hyperlink r:id="rId12">
+      <w:hyperlink r:id="rId18">
         <w:r>
           <w:rPr>
             <w:rFonts w:ascii="Calibri" w:hAnsi="Calibri"/>
             <w:color w:val="1F4E9C"/>
-            <w:sz w:val="18"/>
+            <w:sz w:val="19"/>
             <w:u w:val="single"/>
           </w:rPr>
           <w:t xml:space="preserve">IEEE Xplore</w:t>
@@ -1334,16 +1309,16 @@
           <w:rFonts w:ascii="Calibri" w:hAnsi="Calibri"/>
           <w:b w:val="0"/>
           <w:i w:val="0"/>
-          <w:sz w:val="18"/>
+          <w:sz w:val="19"/>
         </w:rPr>
         <w:t xml:space="preserve"> | </w:t>
       </w:r>
-      <w:hyperlink r:id="rId12">
+      <w:hyperlink r:id="rId18">
         <w:r>
           <w:rPr>
             <w:rFonts w:ascii="Calibri" w:hAnsi="Calibri"/>
             <w:color w:val="1F4E9C"/>
-            <w:sz w:val="18"/>
+            <w:sz w:val="19"/>
             <w:u w:val="single"/>
           </w:rPr>
           <w:t xml:space="preserve">DOI</w:t>
@@ -1354,7 +1329,7 @@
           <w:rFonts w:ascii="Calibri" w:hAnsi="Calibri"/>
           <w:b w:val="0"/>
           <w:i w:val="0"/>
-          <w:sz w:val="18"/>
+          <w:sz w:val="19"/>
         </w:rPr>
         <w:t xml:space="preserve"> | </w:t>
       </w:r>
@@ -1363,7 +1338,7 @@
           <w:rFonts w:ascii="Calibri" w:hAnsi="Calibri"/>
           <w:b w:val="0"/>
           <w:i/>
-          <w:sz w:val="18"/>
+          <w:sz w:val="19"/>
         </w:rPr>
         <w:t>ICCPCT 2026</w:t>
       </w:r>
@@ -1372,7 +1347,7 @@
           <w:rFonts w:ascii="Calibri" w:hAnsi="Calibri"/>
           <w:b w:val="0"/>
           <w:i w:val="0"/>
-          <w:sz w:val="18"/>
+          <w:sz w:val="19"/>
         </w:rPr>
         <w:t xml:space="preserve"> | </w:t>
       </w:r>
@@ -1381,7 +1356,7 @@
           <w:rFonts w:ascii="Calibri" w:hAnsi="Calibri"/>
           <w:b w:val="0"/>
           <w:i/>
-          <w:sz w:val="18"/>
+          <w:sz w:val="19"/>
         </w:rPr>
         <w:t>IEEE Kerala</w:t>
       </w:r>
@@ -1390,7 +1365,7 @@
           <w:rFonts w:ascii="Calibri" w:hAnsi="Calibri"/>
           <w:b w:val="0"/>
           <w:i w:val="0"/>
-          <w:sz w:val="18"/>
+          <w:sz w:val="19"/>
         </w:rPr>
         <w:t xml:space="preserve"> | 2026</w:t>
       </w:r>
@@ -1467,7 +1442,7 @@
         <w:tabs>
           <w:tab w:pos="280" w:val="left"/>
         </w:tabs>
-        <w:spacing w:before="28" w:after="0"/>
+        <w:spacing w:before="40" w:after="0"/>
         <w:ind w:left="280" w:hanging="280"/>
       </w:pPr>
       <w:r>
@@ -1516,7 +1491,7 @@
         <w:tabs>
           <w:tab w:pos="280" w:val="left"/>
         </w:tabs>
-        <w:spacing w:before="28" w:after="0"/>
+        <w:spacing w:before="40" w:after="0"/>
         <w:ind w:left="280" w:hanging="280"/>
       </w:pPr>
       <w:r>
@@ -1624,7 +1599,7 @@
         <w:tabs>
           <w:tab w:pos="280" w:val="left"/>
         </w:tabs>
-        <w:spacing w:before="28" w:after="0"/>
+        <w:spacing w:before="40" w:after="0"/>
         <w:ind w:left="280" w:hanging="280"/>
       </w:pPr>
       <w:r>

</xml_diff>